<commit_message>
Imóvel: múltiplos proprietários; Administração: imóvel filtrado por cliente; contrato de administração em loop
</commit_message>
<xml_diff>
--- a/templates/contrato_administracao.docx
+++ b/templates/contrato_administracao.docx
@@ -131,82 +131,11 @@
       </w:pPr>
       <w:r>
         <w:rPr>
-          <w:b w:val="1"/>
-          <w:bCs w:val="1"/>
-          <w:sz w:val="24"/>
-          <w:szCs w:val="24"/>
-          <w:rtl w:val="0"/>
-        </w:rPr>
-        <w:t xml:space="preserve">{{Cliente}}</w:t>
-      </w:r>
-      <w:r>
-        <w:rPr>
-          <w:sz w:val="24"/>
-          <w:szCs w:val="24"/>
-          <w:rtl w:val="0"/>
-        </w:rPr>
-        <w:t xml:space="preserve">, brasileiro (a), data de nascimento {{DataNascimento}}, devidamente inscrito (a) no CPF nº {{Cpf}}, endereço eletrônico  </w:t>
-      </w:r>
-      <w:r>
-        <w:rPr>
-          <w:sz w:val="24"/>
-          <w:szCs w:val="24"/>
-          <w:highlight w:val="white"/>
-          <w:rtl w:val="0"/>
-        </w:rPr>
-        <w:t xml:space="preserve">{{Email}}, </w:t>
-      </w:r>
-      <w:r>
-        <w:rPr>
-          <w:sz w:val="24"/>
-          <w:szCs w:val="24"/>
-          <w:rtl w:val="0"/>
-        </w:rPr>
-        <w:t xml:space="preserve">{{EstadoCivil}}{{TextoConjuge}}</w:t>
-      </w:r>
-      <w:r>
-        <w:rPr>
-          <w:sz w:val="24"/>
-          <w:szCs w:val="24"/>
-          <w:rtl w:val="0"/>
-        </w:rPr>
-        <w:t xml:space="preserve">,  residente e domiciliada na {{Endereco}} / {{Cidade}} do Estado de {{Estado}}</w:t>
-      </w:r>
-      <w:r>
-        <w:rPr>
-          <w:color w:val="222222"/>
-          <w:sz w:val="24"/>
-          <w:szCs w:val="24"/>
-          <w:highlight w:val="white"/>
-          <w:rtl w:val="0"/>
-        </w:rPr>
-        <w:t xml:space="preserve">, </w:t>
-      </w:r>
-      <w:r>
-        <w:rPr>
-          <w:sz w:val="24"/>
-          <w:szCs w:val="24"/>
-          <w:rtl w:val="0"/>
-        </w:rPr>
-        <w:t xml:space="preserve">doravante denominados </w:t>
-      </w:r>
-      <w:r>
-        <w:rPr>
-          <w:b w:val="1"/>
-          <w:bCs w:val="1"/>
-          <w:sz w:val="24"/>
-          <w:szCs w:val="24"/>
-          <w:rtl w:val="0"/>
-        </w:rPr>
-        <w:t xml:space="preserve">LOCADORA</w:t>
-      </w:r>
-      <w:r>
-        <w:rPr>
-          <w:sz w:val="24"/>
-          <w:szCs w:val="24"/>
-          <w:rtl w:val="0"/>
-        </w:rPr>
-        <w:t xml:space="preserve">.</w:t>
+          <w:sz w:val="24"/>
+          <w:szCs w:val="24"/>
+          <w:rtl w:val="0"/>
+        </w:rPr>
+        <w:t xml:space="preserve">{{#Proprietarios}}{{Nome}}, {{Nacionalidade}}, {{Profissao}}, {{EstadoCivil}}, portador(a) do CPF nº {{Cpf}}, residente e domiciliado(a) na {{Endereco}}.</w:t>
       </w:r>
     </w:p>
     <w:p>
@@ -223,6 +152,7 @@
         <w:rPr>
           <w:rtl w:val="0"/>
         </w:rPr>
+        <w:t xml:space="preserve">{{/Proprietarios}}</w:t>
       </w:r>
     </w:p>
     <w:p>
@@ -237,156 +167,193 @@
       </w:pPr>
       <w:r>
         <w:rPr>
-          <w:b w:val="1"/>
-          <w:bCs w:val="1"/>
-          <w:sz w:val="24"/>
-          <w:szCs w:val="24"/>
-          <w:rtl w:val="0"/>
-        </w:rPr>
-        <w:t xml:space="preserve">DADOS BANCÁRIOS:</w:t>
-      </w:r>
-      <w:r>
-        <w:rPr>
-          <w:sz w:val="24"/>
-          <w:szCs w:val="24"/>
-          <w:rtl w:val="0"/>
-        </w:rPr>
-        <w:t xml:space="preserve"> </w:t>
-      </w:r>
-    </w:p>
-    <w:p>
-      <w:pPr>
-        <w:spacing w:line="360" w:lineRule="auto"/>
-        <w:ind w:left="-850.3937007874016" w:right="-834.3307086614169" w:firstLine="0"/>
-        <w:jc w:val="both"/>
-        <w:rPr>
-          <w:sz w:val="24"/>
-          <w:szCs w:val="24"/>
-        </w:rPr>
-      </w:pPr>
-      <w:r>
-        <w:rPr>
-          <w:sz w:val="24"/>
-          <w:szCs w:val="24"/>
-          <w:rtl w:val="0"/>
-        </w:rPr>
-        <w:t xml:space="preserve">Banco: {{Banco}}</w:t>
-      </w:r>
-    </w:p>
-    <w:p>
-      <w:pPr>
-        <w:spacing w:line="360" w:lineRule="auto"/>
-        <w:ind w:left="-850.3937007874016" w:right="-834.3307086614169" w:firstLine="0"/>
-        <w:jc w:val="both"/>
-        <w:rPr>
-          <w:sz w:val="24"/>
-          <w:szCs w:val="24"/>
-        </w:rPr>
-      </w:pPr>
-      <w:r>
-        <w:rPr>
-          <w:sz w:val="24"/>
-          <w:szCs w:val="24"/>
-          <w:rtl w:val="0"/>
-        </w:rPr>
-        <w:t xml:space="preserve">Código do banco: {{Codigo}}</w:t>
-      </w:r>
-    </w:p>
-    <w:p>
-      <w:pPr>
-        <w:spacing w:line="360" w:lineRule="auto"/>
-        <w:ind w:left="-850.3937007874016" w:right="-834.3307086614169" w:firstLine="0"/>
-        <w:jc w:val="both"/>
-        <w:rPr>
-          <w:sz w:val="24"/>
-          <w:szCs w:val="24"/>
-        </w:rPr>
-      </w:pPr>
-      <w:r>
-        <w:rPr>
-          <w:sz w:val="24"/>
-          <w:szCs w:val="24"/>
-          <w:rtl w:val="0"/>
-        </w:rPr>
-        <w:t xml:space="preserve">Agência: {{Agencia}}</w:t>
-      </w:r>
-    </w:p>
-    <w:p>
-      <w:pPr>
-        <w:spacing w:line="360" w:lineRule="auto"/>
-        <w:ind w:left="-850.3937007874016" w:right="-834.3307086614169" w:firstLine="0"/>
-        <w:jc w:val="both"/>
-        <w:rPr>
-          <w:sz w:val="24"/>
-          <w:szCs w:val="24"/>
-        </w:rPr>
-      </w:pPr>
-      <w:r>
-        <w:rPr>
-          <w:sz w:val="24"/>
-          <w:szCs w:val="24"/>
-          <w:rtl w:val="0"/>
-        </w:rPr>
-        <w:t xml:space="preserve">Conta Corrente: {{Conta}}</w:t>
-      </w:r>
-    </w:p>
-    <w:p>
-      <w:pPr>
-        <w:spacing w:line="360" w:lineRule="auto"/>
-        <w:ind w:left="-850.3937007874016" w:right="-834.3307086614169" w:firstLine="0"/>
-        <w:jc w:val="both"/>
-        <w:rPr>
-          <w:sz w:val="24"/>
-          <w:szCs w:val="24"/>
-        </w:rPr>
-      </w:pPr>
-      <w:r>
-        <w:rPr>
-          <w:sz w:val="24"/>
-          <w:szCs w:val="24"/>
-          <w:rtl w:val="0"/>
-        </w:rPr>
-        <w:t xml:space="preserve">Pix/{{TipoPix}}: {{Pix}}</w:t>
-      </w:r>
-    </w:p>
-    <w:p>
-      <w:pPr>
-        <w:spacing w:line="360" w:lineRule="auto"/>
-        <w:ind w:left="-850.3937007874016" w:right="-834.3307086614169" w:firstLine="0"/>
-        <w:jc w:val="both"/>
-        <w:rPr>
-          <w:sz w:val="24"/>
-          <w:szCs w:val="24"/>
-        </w:rPr>
-      </w:pPr>
-      <w:r>
-        <w:rPr>
-          <w:sz w:val="24"/>
-          <w:szCs w:val="24"/>
-          <w:rtl w:val="0"/>
-        </w:rPr>
-        <w:t xml:space="preserve">Favorecido: </w:t>
-      </w:r>
-      <w:r>
-        <w:rPr>
-          <w:b w:val="1"/>
-          <w:bCs w:val="1"/>
-          <w:sz w:val="24"/>
-          <w:szCs w:val="24"/>
-          <w:rtl w:val="0"/>
-        </w:rPr>
-        <w:t xml:space="preserve">{{Cliente}}</w:t>
-      </w:r>
-      <w:r>
-        <w:rPr>
-          <w:rtl w:val="0"/>
-        </w:rPr>
+          <w:sz w:val="24"/>
+          <w:szCs w:val="24"/>
+          <w:rtl w:val="0"/>
+        </w:rPr>
+        <w:t xml:space="preserve">Doravante denominados, em conjunto ou isoladamente, </w:t>
+      </w:r>
+      <w:r>
+        <w:rPr>
+          <w:b w:val="1"/>
+          <w:bCs w:val="1"/>
+          <w:sz w:val="24"/>
+          <w:szCs w:val="24"/>
+          <w:rtl w:val="0"/>
+        </w:rPr>
+        <w:t xml:space="preserve">LOCADOR(ES)</w:t>
+      </w:r>
+      <w:r>
+        <w:rPr>
+          <w:sz w:val="24"/>
+          <w:szCs w:val="24"/>
+          <w:rtl w:val="0"/>
+        </w:rPr>
+        <w:t xml:space="preserve">.</w:t>
       </w:r>
     </w:p>
     <w:p>
       <w:pPr>
         <w:spacing w:line="360" w:lineRule="auto"/>
         <w:ind w:left="-850.3937007874016" w:right="-891.2598425196836" w:firstLine="0"/>
+        <w:jc w:val="both"/>
+        <w:rPr>
+          <w:sz w:val="24"/>
+          <w:szCs w:val="24"/>
+        </w:rPr>
+      </w:pPr>
+      <w:r>
+        <w:rPr>
+          <w:b w:val="1"/>
+          <w:bCs w:val="1"/>
+          <w:sz w:val="24"/>
+          <w:szCs w:val="24"/>
+          <w:rtl w:val="0"/>
+        </w:rPr>
+        <w:t xml:space="preserve">DADOS BANCÁRIOS:</w:t>
+      </w:r>
+      <w:r>
+        <w:rPr>
+          <w:sz w:val="24"/>
+          <w:szCs w:val="24"/>
+          <w:rtl w:val="0"/>
+        </w:rPr>
+        <w:t xml:space="preserve"> </w:t>
+      </w:r>
+    </w:p>
+    <w:p>
+      <w:pPr>
+        <w:spacing w:line="360" w:lineRule="auto"/>
+        <w:ind w:left="-850.3937007874016" w:right="-834.3307086614169" w:firstLine="0"/>
+        <w:jc w:val="both"/>
+        <w:rPr>
+          <w:sz w:val="24"/>
+          <w:szCs w:val="24"/>
+        </w:rPr>
+      </w:pPr>
+      <w:r>
+        <w:rPr>
+          <w:sz w:val="24"/>
+          <w:szCs w:val="24"/>
+          <w:rtl w:val="0"/>
+        </w:rPr>
+        <w:t xml:space="preserve">Banco: {{Banco}}</w:t>
+      </w:r>
+    </w:p>
+    <w:p>
+      <w:pPr>
+        <w:spacing w:line="360" w:lineRule="auto"/>
+        <w:ind w:left="-850.3937007874016" w:right="-834.3307086614169" w:firstLine="0"/>
+        <w:jc w:val="both"/>
+        <w:rPr>
+          <w:sz w:val="24"/>
+          <w:szCs w:val="24"/>
+        </w:rPr>
+      </w:pPr>
+      <w:r>
+        <w:rPr>
+          <w:sz w:val="24"/>
+          <w:szCs w:val="24"/>
+          <w:rtl w:val="0"/>
+        </w:rPr>
+        <w:t xml:space="preserve">Código do banco: {{Codigo}}</w:t>
+      </w:r>
+    </w:p>
+    <w:p>
+      <w:pPr>
+        <w:spacing w:line="360" w:lineRule="auto"/>
+        <w:ind w:left="-850.3937007874016" w:right="-834.3307086614169" w:firstLine="0"/>
+        <w:jc w:val="both"/>
+        <w:rPr>
+          <w:sz w:val="24"/>
+          <w:szCs w:val="24"/>
+        </w:rPr>
+      </w:pPr>
+      <w:r>
+        <w:rPr>
+          <w:sz w:val="24"/>
+          <w:szCs w:val="24"/>
+          <w:rtl w:val="0"/>
+        </w:rPr>
+        <w:t xml:space="preserve">Agência: {{Agencia}}</w:t>
+      </w:r>
+    </w:p>
+    <w:p>
+      <w:pPr>
+        <w:spacing w:line="360" w:lineRule="auto"/>
+        <w:ind w:left="-850.3937007874016" w:right="-834.3307086614169" w:firstLine="0"/>
+        <w:jc w:val="both"/>
+        <w:rPr>
+          <w:sz w:val="24"/>
+          <w:szCs w:val="24"/>
+        </w:rPr>
+      </w:pPr>
+      <w:r>
+        <w:rPr>
+          <w:sz w:val="24"/>
+          <w:szCs w:val="24"/>
+          <w:rtl w:val="0"/>
+        </w:rPr>
+        <w:t xml:space="preserve">Conta Corrente: {{Conta}}</w:t>
+      </w:r>
+    </w:p>
+    <w:p>
+      <w:pPr>
+        <w:spacing w:line="360" w:lineRule="auto"/>
+        <w:ind w:left="-850.3937007874016" w:right="-834.3307086614169" w:firstLine="0"/>
+        <w:jc w:val="both"/>
+        <w:rPr>
+          <w:sz w:val="24"/>
+          <w:szCs w:val="24"/>
+        </w:rPr>
+      </w:pPr>
+      <w:r>
+        <w:rPr>
+          <w:sz w:val="24"/>
+          <w:szCs w:val="24"/>
+          <w:rtl w:val="0"/>
+        </w:rPr>
+        <w:t xml:space="preserve">Pix/{{TipoPix}}: {{Pix}}</w:t>
+      </w:r>
+    </w:p>
+    <w:p>
+      <w:pPr>
+        <w:spacing w:line="360" w:lineRule="auto"/>
+        <w:ind w:left="-850.3937007874016" w:right="-834.3307086614169" w:firstLine="0"/>
+        <w:jc w:val="both"/>
+        <w:rPr>
+          <w:sz w:val="24"/>
+          <w:szCs w:val="24"/>
+        </w:rPr>
+      </w:pPr>
+      <w:r>
+        <w:rPr>
+          <w:sz w:val="24"/>
+          <w:szCs w:val="24"/>
+          <w:rtl w:val="0"/>
+        </w:rPr>
+        <w:t xml:space="preserve">Favorecido: </w:t>
+      </w:r>
+      <w:r>
+        <w:rPr>
+          <w:b w:val="1"/>
+          <w:bCs w:val="1"/>
+          <w:sz w:val="24"/>
+          <w:szCs w:val="24"/>
+          <w:rtl w:val="0"/>
+        </w:rPr>
+        <w:t xml:space="preserve">{{Cliente}}</w:t>
+      </w:r>
+      <w:r>
+        <w:rPr>
+          <w:rtl w:val="0"/>
+        </w:rPr>
+      </w:r>
+    </w:p>
+    <w:p>
+      <w:pPr>
+        <w:spacing w:line="360" w:lineRule="auto"/>
+        <w:ind w:left="-850.3937007874016" w:right="-891.2598425196836" w:firstLine="0"/>
         <w:rPr>
           <w:sz w:val="24"/>
           <w:szCs w:val="24"/>
@@ -441,23 +408,7 @@
           <w:szCs w:val="24"/>
           <w:rtl w:val="0"/>
         </w:rPr>
-        <w:t xml:space="preserve">2.1. O presente contrato tem por objeto a </w:t>
-      </w:r>
-      <w:r>
-        <w:rPr>
-          <w:sz w:val="24"/>
-          <w:szCs w:val="24"/>
-          <w:rtl w:val="0"/>
-        </w:rPr>
-        <w:t xml:space="preserve">administração integral do imóvel </w:t>
-      </w:r>
-      <w:r>
-        <w:rPr>
-          <w:sz w:val="24"/>
-          <w:szCs w:val="24"/>
-          <w:rtl w:val="0"/>
-        </w:rPr>
-        <w:t xml:space="preserve">de propriedade da LOCADORA abrangendo, sem limitação: intermediação da locação, gestão contratual, cobrança administrativa e judicial, acompanhamento financeiro, adoção de medidas legais e extrajudiciais, bem como todos os atos necessários à plena execução da locação. Localizado na </w:t>
+        <w:t xml:space="preserve">2.1. O presente contrato tem por objeto a administração integral do imóvel de propriedade da LOCADORA abrangendo, sem limitação: intermediação da locação, gestão contratual, cobrança administrativa e judicial, acompanhamento financeiro, adoção de medidas legais e extrajudiciais, bem como todos os atos necessários à plena execução da locação. Localizado na </w:t>
       </w:r>
       <w:r>
         <w:rPr>
@@ -2011,7 +1962,7 @@
           <w:szCs w:val="24"/>
           <w:rtl w:val="0"/>
         </w:rPr>
-        <w:t xml:space="preserve">____________________________________</w:t>
+        <w:t xml:space="preserve">{{#Proprietarios}}____________________________________</w:t>
       </w:r>
     </w:p>
     <w:p>
@@ -2031,7 +1982,7 @@
           <w:szCs w:val="24"/>
           <w:rtl w:val="0"/>
         </w:rPr>
-        <w:t xml:space="preserve">{{Cliente}}</w:t>
+        <w:t xml:space="preserve">{{Nome}}</w:t>
       </w:r>
       <w:r>
         <w:rPr>
@@ -2104,136 +2055,7 @@
         <w:rPr>
           <w:rtl w:val="0"/>
         </w:rPr>
-      </w:r>
-    </w:p>
-    <w:p>
-      <w:pPr>
-        <w:spacing w:line="276" w:lineRule="auto"/>
-        <w:ind w:left="-566" w:right="-607" w:firstLine="0"/>
-        <w:jc w:val="center"/>
-        <w:rPr>
-          <w:sz w:val="24"/>
-          <w:szCs w:val="24"/>
-        </w:rPr>
-      </w:pPr>
-      <w:r>
-        <w:rPr>
-          <w:sz w:val="24"/>
-          <w:szCs w:val="24"/>
-          <w:rtl w:val="0"/>
-        </w:rPr>
-        <w:t xml:space="preserve">{{AssinaturaConjugeInicio}}</w:t>
-      </w:r>
-    </w:p>
-    <w:p>
-      <w:pPr>
-        <w:spacing w:line="276" w:lineRule="auto"/>
-        <w:ind w:left="-566" w:right="-607" w:firstLine="0"/>
-        <w:jc w:val="center"/>
-        <w:rPr>
-          <w:sz w:val="24"/>
-          <w:szCs w:val="24"/>
-        </w:rPr>
-      </w:pPr>
-      <w:r>
-        <w:rPr>
-          <w:sz w:val="24"/>
-          <w:szCs w:val="24"/>
-          <w:rtl w:val="0"/>
-        </w:rPr>
-        <w:t xml:space="preserve">____________________________________</w:t>
-      </w:r>
-    </w:p>
-    <w:p>
-      <w:pPr>
-        <w:spacing w:line="276" w:lineRule="auto"/>
-        <w:ind w:left="-566" w:right="-607" w:firstLine="0"/>
-        <w:jc w:val="center"/>
-        <w:rPr>
-          <w:sz w:val="24"/>
-          <w:szCs w:val="24"/>
-        </w:rPr>
-      </w:pPr>
-      <w:r>
-        <w:rPr>
-          <w:sz w:val="24"/>
-          <w:szCs w:val="24"/>
-          <w:rtl w:val="0"/>
-        </w:rPr>
-        <w:t xml:space="preserve">{{ConjugeNomeAss}}</w:t>
-      </w:r>
-    </w:p>
-    <w:p>
-      <w:pPr>
-        <w:spacing w:line="276" w:lineRule="auto"/>
-        <w:ind w:left="-566" w:right="-607" w:firstLine="0"/>
-        <w:jc w:val="center"/>
-        <w:rPr>
-          <w:sz w:val="24"/>
-          <w:szCs w:val="24"/>
-        </w:rPr>
-      </w:pPr>
-      <w:r>
-        <w:rPr>
-          <w:sz w:val="24"/>
-          <w:szCs w:val="24"/>
-          <w:rtl w:val="0"/>
-        </w:rPr>
-        <w:t xml:space="preserve">CPF nº {{ConjugeCpfAss}}</w:t>
-      </w:r>
-    </w:p>
-    <w:p>
-      <w:pPr>
-        <w:spacing w:line="276" w:lineRule="auto"/>
-        <w:ind w:left="-566" w:right="-607" w:firstLine="0"/>
-        <w:jc w:val="center"/>
-        <w:rPr>
-          <w:sz w:val="24"/>
-          <w:szCs w:val="24"/>
-        </w:rPr>
-      </w:pPr>
-      <w:r>
-        <w:rPr>
-          <w:sz w:val="24"/>
-          <w:szCs w:val="24"/>
-          <w:rtl w:val="0"/>
-        </w:rPr>
-        <w:t xml:space="preserve">CÔNJUGE</w:t>
-      </w:r>
-    </w:p>
-    <w:p>
-      <w:pPr>
-        <w:spacing w:line="276" w:lineRule="auto"/>
-        <w:ind w:left="-566" w:right="-607" w:firstLine="0"/>
-        <w:jc w:val="center"/>
-        <w:rPr>
-          <w:sz w:val="24"/>
-          <w:szCs w:val="24"/>
-        </w:rPr>
-      </w:pPr>
-      <w:r>
-        <w:rPr>
-          <w:rtl w:val="0"/>
-        </w:rPr>
-      </w:r>
-    </w:p>
-    <w:p>
-      <w:pPr>
-        <w:spacing w:line="276" w:lineRule="auto"/>
-        <w:ind w:left="-566" w:right="-607" w:firstLine="0"/>
-        <w:jc w:val="center"/>
-        <w:rPr>
-          <w:sz w:val="24"/>
-          <w:szCs w:val="24"/>
-        </w:rPr>
-      </w:pPr>
-      <w:r>
-        <w:rPr>
-          <w:sz w:val="24"/>
-          <w:szCs w:val="24"/>
-          <w:rtl w:val="0"/>
-        </w:rPr>
-        <w:t xml:space="preserve">{{AssinaturaConjugeFim}}</w:t>
+        <w:t xml:space="preserve">{{/Proprietarios}}</w:t>
       </w:r>
     </w:p>
     <w:p>

</xml_diff>